<commit_message>
docs(HCO v2): PSQ policy fixes
</commit_message>
<xml_diff>
--- a/policies/build/chapters_v2/PSQ/HCO_PSQ_1_v2_REWRITE_DRAFT.docx
+++ b/policies/build/chapters_v2/PSQ/HCO_PSQ_1_v2_REWRITE_DRAFT.docx
@@ -1955,6 +1955,66 @@
     </w:p>
     <w:p>
       <w:pPr>
+        <w:pStyle w:val="ListBullet"/>
+      </w:pPr>
+      <w:r>
+        <w:t xml:space="preserve">Ministry of Health and Family Welfare, Government of India. (2018). </w:t>
+      </w:r>
+      <w:hyperlink r:id="rId9">
+        <w:r>
+          <w:rPr>
+            <w:color w:val="0563C1"/>
+            <w:u w:val="single"/>
+          </w:rPr>
+          <w:t>https://mohfw.gov.in/sites/default/files/national%20patient%20safety%20implimentation_for%20web.pdf</w:t>
+        </w:r>
+      </w:hyperlink>
+      <w:r>
+        <w:t xml:space="preserve"> National Patient Safety Implementation Framework (2018-2025).</w:t>
+      </w:r>
+    </w:p>
+    <w:p>
+      <w:pPr>
+        <w:pStyle w:val="ListBullet"/>
+      </w:pPr>
+      <w:r>
+        <w:t xml:space="preserve">World Health Organization. (n.d.). </w:t>
+      </w:r>
+      <w:hyperlink r:id="rId10">
+        <w:r>
+          <w:rPr>
+            <w:color w:val="0563C1"/>
+            <w:u w:val="single"/>
+          </w:rPr>
+          <w:t>https://www.who.int/teams/integrated-health-services/patient-safety/research/patient-safety-solutions</w:t>
+        </w:r>
+      </w:hyperlink>
+      <w:r>
+        <w:t xml:space="preserve"> Patient Safety Solutions.</w:t>
+      </w:r>
+    </w:p>
+    <w:p>
+      <w:pPr>
+        <w:pStyle w:val="ListBullet"/>
+      </w:pPr>
+      <w:r>
+        <w:t xml:space="preserve">Joint Commission International. (n.d.). </w:t>
+      </w:r>
+      <w:hyperlink r:id="rId11">
+        <w:r>
+          <w:rPr>
+            <w:color w:val="0563C1"/>
+            <w:u w:val="single"/>
+          </w:rPr>
+          <w:t>https://www.jointcommissioninternational.org/standards/international-patient-safety-goals</w:t>
+        </w:r>
+      </w:hyperlink>
+      <w:r>
+        <w:t xml:space="preserve"> International Patient Safety Goals.</w:t>
+      </w:r>
+    </w:p>
+    <w:p>
+      <w:pPr>
         <w:pStyle w:val="Heading1"/>
       </w:pPr>
       <w:r>

</xml_diff>

<commit_message>
docs(HCO v2): PSQ policy fixes, Records and SOPs package, regenerated PDFs
</commit_message>
<xml_diff>
--- a/policies/build/chapters_v2/PSQ/HCO_PSQ_1_v2_REWRITE_DRAFT.docx
+++ b/policies/build/chapters_v2/PSQ/HCO_PSQ_1_v2_REWRITE_DRAFT.docx
@@ -367,6 +367,12 @@
       </w:r>
     </w:p>
     <w:p>
+      <w:pPr/>
+      <w:r>
+        <w:t>A no-harm event is one where an error occurred but, fortunately, no injury resulted — for example, a penicillin-allergic patient is prescribed cephalosporin, but the error is caught before it is administered and no dose is given. A sentinel event is an unanticipated occurrence involving death or serious physical or psychological injury, not related to the patient's underlying illness, but related to the medical equipment, supplies or care provided (NABH Guidebook, Glossary of Terms).</w:t>
+      </w:r>
+    </w:p>
+    <w:p>
       <w:pPr>
         <w:pStyle w:val="Heading2"/>
       </w:pPr>
@@ -410,6 +416,12 @@
       <w:pPr/>
       <w:r>
         <w:t>The safety committee is responsible for proactive risk assessment, covering both clinical and non-clinical processes and areas. Proactive analysis may be done using tools such as Hazard Identification and Risk Analysis (HIRA), Failure Modes and Effects Analysis (FMEA), Hazard Vulnerability Analysis (HVA), fault tree analysis or simulations.</w:t>
+      </w:r>
+    </w:p>
+    <w:p>
+      <w:pPr/>
+      <w:r>
+        <w:t>HIRA identifies hazards and rates each by likelihood and severity, so the highest-priority risks get attention first. FMEA examines a process step by step for every way it could fail, before failure happens, and prioritises the failure modes with the greatest potential impact. HVA identifies the emergencies an organisation could face and analyses their direct and indirect effect on operations and on the ability to keep delivering services.</w:t>
       </w:r>
     </w:p>
     <w:p>
@@ -468,6 +480,12 @@
       <w:pPr/>
       <w:r>
         <w:t>At a minimum, the organisation shall adhere to the current National Patient-Safety Framework, WHO Patient Safety Solutions and the International Patient Safety Goals.</w:t>
+      </w:r>
+    </w:p>
+    <w:p>
+      <w:pPr/>
+      <w:r>
+        <w:t>International Patient Safety Goals typically cover patient identification, effective communication between caregivers, high-alert medication safety, correct-site surgery, infection control and fall prevention.</w:t>
       </w:r>
     </w:p>
     <w:p>
@@ -2042,7 +2060,7 @@
     <w:p>
       <w:pPr/>
       <w:r>
-        <w:t>This document is not issued by, endorsed by, or affiliated with NABH, the World Health Organization, the National Centre for Disease Control, the Food Safety and Standards Authority of India, any Pollution Control Board, or any other body named in it. Wording is original; no text has been reproduced from the standards, rules or guidelines referenced.</w:t>
+        <w:t>This document is not issued by, endorsed by, or affiliated with NABH or any other body named in it. Wording is original; no text has been reproduced from the standards, rules or guidelines referenced.</w:t>
       </w:r>
     </w:p>
     <w:sectPr>

</xml_diff>